<commit_message>
Generalize PR user security guide
</commit_message>
<xml_diff>
--- a/docs/guia-usuario-prs.docx
+++ b/docs/guia-usuario-prs.docx
@@ -7,53 +7,12 @@
         <w:pStyle w:val="Title"/>
       </w:pPr>
       <w:r>
-        <w:t>Guia de PRs para usuários</w:t>
+        <w:t>Guia do usuário para Pull Requests e verificações de segurança</w:t>
       </w:r>
     </w:p>
     <w:p>
       <w:r>
-        <w:rPr>
-          <w:b/>
-        </w:rPr>
-        <w:t>Projeto:</w:t>
-      </w:r>
-      <w:r>
-        <w:t xml:space="preserve"> Som &amp; Corda — loja de instrumentos</w:t>
-      </w:r>
-    </w:p>
-    <w:p>
-      <w:r>
-        <w:rPr>
-          <w:b/>
-        </w:rPr>
-        <w:t>Repositório:</w:t>
-      </w:r>
-      <w:r>
-        <w:t xml:space="preserve"> </w:t>
-      </w:r>
-      <w:r>
-        <w:rPr>
-          <w:rFonts w:ascii="Consolas" w:hAnsi="Consolas"/>
-          <w:color w:val="5B2C83"/>
-          <w:sz w:val="18"/>
-        </w:rPr>
-        <w:t>aeroschmidt/scanner-loja-instrumentos</w:t>
-      </w:r>
-    </w:p>
-    <w:p>
-      <w:r>
-        <w:rPr>
-          <w:b/>
-        </w:rPr>
-        <w:t>Atualizado:</w:t>
-      </w:r>
-      <w:r>
-        <w:t xml:space="preserve"> 10 de outubro de 2026</w:t>
-      </w:r>
-    </w:p>
-    <w:p>
-      <w:r>
-        <w:t xml:space="preserve">Este guia é para quem abre, revisa ou acompanha Pull Requests. Ele mostra o que o GitHub Actions verifica hoje, o que procurar quando Code Scanning estiver ativo e como interpretar a demonstração do PR #9. Configurações administrativas ficam no </w:t>
+        <w:t xml:space="preserve">Este guia explica como autores e revisores de código acompanham um Pull Request (PR) no GitHub quando há verificações automáticas. Ele ajuda a interpretar resultados do GitHub Actions e do GitHub Advanced Security (GHAS), responder a alertas e decidir o que precisa de revisão humana. O administrador do repositório configura as ferramentas; as instruções de configuração ficam no </w:t>
       </w:r>
       <w:r>
         <w:t>guia da mantenedora — guia-maintainer-ghas.md</w:t>
@@ -64,13 +23,7 @@
     </w:p>
     <w:p>
       <w:r>
-        <w:rPr>
-          <w:b/>
-        </w:rPr>
-        <w:t>Estado deste exercício:</w:t>
-      </w:r>
-      <w:r>
-        <w:t xml:space="preserve"> GitHub Actions está ativo. CodeQL / Code Scanning, Dependabot e Secret Scanning estão desligados; por isso, a demonstração não recebeu análise CodeQL.</w:t>
+        <w:t>Um check verde significa que aquela verificação terminou com sucesso. Isso não prova, por si só, que o código está livre de defeitos ou seguro. Alertas de segurança e bloqueios de merge também são coisas diferentes: o alerta aponta um achado; a regra de proteção da branch define se o merge fica impedido até a resolução.</w:t>
       </w:r>
     </w:p>
     <w:p>
@@ -78,15 +31,71 @@
         <w:pStyle w:val="Heading1"/>
       </w:pPr>
       <w:r>
-        <w:t>1. Fluxos de Pull Request</w:t>
+        <w:t>1. Quem faz o quê</w:t>
       </w:r>
     </w:p>
     <w:p>
       <w:pPr>
-        <w:pStyle w:val="Heading2"/>
+        <w:pStyle w:val="ListBullet"/>
       </w:pPr>
       <w:r>
-        <w:t>PR comum com GitHub Actions</w:t>
+        <w:rPr>
+          <w:b/>
+        </w:rPr>
+        <w:t>Autor do PR:</w:t>
+      </w:r>
+      <w:r>
+        <w:t xml:space="preserve"> descreve a mudança, acompanha os checks, corrige falhas e responde às observações da revisão.</w:t>
+      </w:r>
+    </w:p>
+    <w:p>
+      <w:pPr>
+        <w:pStyle w:val="ListBullet"/>
+      </w:pPr>
+      <w:r>
+        <w:rPr>
+          <w:b/>
+        </w:rPr>
+        <w:t>Revisor:</w:t>
+      </w:r>
+      <w:r>
+        <w:t xml:space="preserve"> entende o objetivo e o diff, verifica os resultados automáticos e pede ajustes quando necessário.</w:t>
+      </w:r>
+    </w:p>
+    <w:p>
+      <w:pPr>
+        <w:pStyle w:val="ListBullet"/>
+      </w:pPr>
+      <w:r>
+        <w:rPr>
+          <w:b/>
+        </w:rPr>
+        <w:t>Administrador do repositório:</w:t>
+      </w:r>
+      <w:r>
+        <w:t xml:space="preserve"> habilita e configura workflows, ferramentas de segurança e regras de proteção. Consulte o guia da mantenedora para essas tarefas.</w:t>
+      </w:r>
+    </w:p>
+    <w:p>
+      <w:pPr>
+        <w:pStyle w:val="ListBullet"/>
+      </w:pPr>
+      <w:r>
+        <w:rPr>
+          <w:b/>
+        </w:rPr>
+        <w:t>Bots:</w:t>
+      </w:r>
+      <w:r>
+        <w:t xml:space="preserve"> podem executar análises ou propor atualizações. Um resultado automático não substitui a revisão e aprovação previstas pelo processo da equipe.</w:t>
+      </w:r>
+    </w:p>
+    <w:p>
+      <w:pPr>
+        <w:pStyle w:val="Heading1"/>
+      </w:pPr>
+      <w:r>
+        <w:t>2. Fluxo normal de um Pull Request</w:t>
       </w:r>
     </w:p>
     <w:p>
@@ -94,7 +103,7 @@
         <w:pStyle w:val="ListNumber"/>
       </w:pPr>
       <w:r>
-        <w:t>Crie uma branch e faça commits assinados conforme a configuração do repositório.</w:t>
+        <w:t>Crie uma branch para a mudança e mantenha cada PR focado em um objetivo.</w:t>
       </w:r>
     </w:p>
     <w:p>
@@ -102,18 +111,7 @@
         <w:pStyle w:val="ListNumber"/>
       </w:pPr>
       <w:r>
-        <w:t xml:space="preserve">Abra um PR para </w:t>
-      </w:r>
-      <w:r>
-        <w:rPr>
-          <w:rFonts w:ascii="Consolas" w:hAnsi="Consolas"/>
-          <w:color w:val="5B2C83"/>
-          <w:sz w:val="18"/>
-        </w:rPr>
-        <w:t>main</w:t>
-      </w:r>
-      <w:r>
-        <w:t xml:space="preserve"> e explique a mudança.</w:t>
+        <w:t>Abra o PR para a branch de destino indicada pela equipe. Explique o motivo, o que mudou, como foi verificado e quais riscos merecem atenção.</w:t>
       </w:r>
     </w:p>
     <w:p>
@@ -121,7 +119,7 @@
         <w:pStyle w:val="ListNumber"/>
       </w:pPr>
       <w:r>
-        <w:t xml:space="preserve">Em </w:t>
+        <w:t xml:space="preserve">Aguarde os checks na área </w:t>
       </w:r>
       <w:r>
         <w:rPr>
@@ -130,16 +128,7 @@
         <w:t>Checks</w:t>
       </w:r>
       <w:r>
-        <w:t xml:space="preserve">, aguarde </w:t>
-      </w:r>
-      <w:r>
-        <w:rPr>
-          <w:b/>
-        </w:rPr>
-        <w:t>Build and test / Build and test with Maven</w:t>
-      </w:r>
-      <w:r>
-        <w:t>.</w:t>
+        <w:t xml:space="preserve"> ou na seção de status do PR. Enquanto estiverem em execução, espere a conclusão antes de interpretar o resultado.</w:t>
       </w:r>
     </w:p>
     <w:p>
@@ -147,7 +136,7 @@
         <w:pStyle w:val="ListNumber"/>
       </w:pPr>
       <w:r>
-        <w:t>Se falhar, abra o job, expanda o step vermelho e use o log para localizar o erro de compilação/teste.</w:t>
+        <w:t>Se um check falhar, abra o detalhe do job, localize a etapa marcada como falha e leia o log a partir da primeira mensagem de erro relevante. Corrija a causa e envie uma nova alteração para o mesmo PR.</w:t>
       </w:r>
     </w:p>
     <w:p>
@@ -155,659 +144,7 @@
         <w:pStyle w:val="ListNumber"/>
       </w:pPr>
       <w:r>
-        <w:t>Aguarde a revisão e aprovação da proprietária. O assistente não aprova nem faz merge de PRs.</w:t>
-      </w:r>
-    </w:p>
-    <w:p>
-      <w:pPr>
-        <w:pStyle w:val="Heading2"/>
-      </w:pPr>
-      <w:r>
-        <w:t>PR quando Code Scanning estiver habilitado</w:t>
-      </w:r>
-    </w:p>
-    <w:p>
-      <w:pPr>
-        <w:pStyle w:val="ListNumber"/>
-      </w:pPr>
-      <w:r>
-        <w:t>Consulte o check de Code Scanning no PR junto com o build Maven.</w:t>
-      </w:r>
-    </w:p>
-    <w:p>
-      <w:pPr>
-        <w:pStyle w:val="ListNumber"/>
-      </w:pPr>
-      <w:r>
-        <w:t>Abra cada alerta para ver a regra, severidade, arquivo e linha indicados.</w:t>
-      </w:r>
-    </w:p>
-    <w:p>
-      <w:pPr>
-        <w:pStyle w:val="ListNumber"/>
-      </w:pPr>
-      <w:r>
-        <w:t>Corrija no código e envie um novo commit; confirme se a nova análise atualizou ou fechou o alerta.</w:t>
-      </w:r>
-    </w:p>
-    <w:p>
-      <w:pPr>
-        <w:pStyle w:val="ListNumber"/>
-      </w:pPr>
-      <w:r>
-        <w:t>Trate os checks como sinais para revisão. O bloqueio de merge depende da regra de branch configurada pela administração.</w:t>
-      </w:r>
-    </w:p>
-    <w:p>
-      <w:pPr>
-        <w:pStyle w:val="Heading2"/>
-      </w:pPr>
-      <w:r>
-        <w:t>PR automático do Dependabot</w:t>
-      </w:r>
-    </w:p>
-    <w:p>
-      <w:pPr>
-        <w:pStyle w:val="ListNumber"/>
-      </w:pPr>
-      <w:r>
-        <w:t>Confira no diff quais dependências e versões foram alteradas.</w:t>
-      </w:r>
-    </w:p>
-    <w:p>
-      <w:pPr>
-        <w:pStyle w:val="ListNumber"/>
-      </w:pPr>
-      <w:r>
-        <w:t>Leia a descrição do alerta/atualização e examine os checks do PR.</w:t>
-      </w:r>
-    </w:p>
-    <w:p>
-      <w:pPr>
-        <w:pStyle w:val="ListNumber"/>
-      </w:pPr>
-      <w:r>
-        <w:t>Revise compatibilidade e testes como em qualquer PR. Um PR do bot não deve ser aprovado automaticamente neste exercício.</w:t>
-      </w:r>
-    </w:p>
-    <w:p>
-      <w:pPr>
-        <w:pStyle w:val="ListNumber"/>
-      </w:pPr>
-      <w:r>
-        <w:t>Somente a proprietária aprova e faz merge.</w:t>
-      </w:r>
-    </w:p>
-    <w:p>
-      <w:pPr>
-        <w:pStyle w:val="Heading2"/>
-      </w:pPr>
-      <w:r>
-        <w:t>Push protection</w:t>
-      </w:r>
-    </w:p>
-    <w:p>
-      <w:r>
-        <w:t>Se um push for bloqueado por uma possível credencial, não contorne o bloqueio com um segredo real. Remova o valor do código/histórico conforme o caso, use um armazenamento seguro para credenciais e siga o procedimento da organização.</w:t>
-      </w:r>
-    </w:p>
-    <w:p>
-      <w:pPr>
-        <w:pStyle w:val="Heading1"/>
-      </w:pPr>
-      <w:r>
-        <w:t>2. Exemplo prático: PR #9</w:t>
-      </w:r>
-    </w:p>
-    <w:p>
-      <w:r>
-        <w:rPr>
-          <w:b/>
-        </w:rPr>
-        <w:t>PR:</w:t>
-      </w:r>
-      <w:r>
-        <w:t xml:space="preserve"> </w:t>
-      </w:r>
-      <w:r>
-        <w:t>Demonstração controlada de SQL Injection — https://github.com/aeroschmidt/scanner-loja-instrumentos/pull/9</w:t>
-      </w:r>
-    </w:p>
-    <w:p>
-      <w:r>
-        <w:rPr>
-          <w:b/>
-        </w:rPr>
-        <w:t>Branch:</w:t>
-      </w:r>
-      <w:r>
-        <w:t xml:space="preserve"> </w:t>
-      </w:r>
-      <w:r>
-        <w:rPr>
-          <w:rFonts w:ascii="Consolas" w:hAnsi="Consolas"/>
-          <w:color w:val="5B2C83"/>
-          <w:sz w:val="18"/>
-        </w:rPr>
-        <w:t>demo/vulnerabilidade-sql-sem-code-scanning</w:t>
-      </w:r>
-    </w:p>
-    <w:p>
-      <w:r>
-        <w:rPr>
-          <w:b/>
-        </w:rPr>
-        <w:t>Commit:</w:t>
-      </w:r>
-      <w:r>
-        <w:t xml:space="preserve"> </w:t>
-      </w:r>
-      <w:r>
-        <w:rPr>
-          <w:rFonts w:ascii="Consolas" w:hAnsi="Consolas"/>
-          <w:color w:val="5B2C83"/>
-          <w:sz w:val="18"/>
-        </w:rPr>
-        <w:t>32da6b1</w:t>
-      </w:r>
-      <w:r>
-        <w:t xml:space="preserve"> — mensagem assinada e verificada pelo GitHub.</w:t>
-      </w:r>
-    </w:p>
-    <w:p>
-      <w:r>
-        <w:t xml:space="preserve">Este PR foi criado para comparar a compilação do Actions com a análise de segurança do CodeQL. Ele adiciona uma rota isolada de demonstração que monta uma consulta SQL concatenando a entrada </w:t>
-      </w:r>
-      <w:r>
-        <w:rPr>
-          <w:rFonts w:ascii="Consolas" w:hAnsi="Consolas"/>
-          <w:color w:val="5B2C83"/>
-          <w:sz w:val="18"/>
-        </w:rPr>
-        <w:t>name</w:t>
-      </w:r>
-      <w:r>
-        <w:t>. A rota comum de busca continua usando consulta parametrizada. O código vulnerável existe apenas para o exercício e não deve ser mesclado nem usado em produção.</w:t>
-      </w:r>
-    </w:p>
-    <w:p>
-      <w:pPr>
-        <w:pStyle w:val="Heading2"/>
-      </w:pPr>
-      <w:r>
-        <w:t>Resultado observado</w:t>
-      </w:r>
-    </w:p>
-    <w:p>
-      <w:pPr>
-        <w:pStyle w:val="ListBullet"/>
-      </w:pPr>
-      <w:r>
-        <w:t xml:space="preserve">O workflow </w:t>
-      </w:r>
-      <w:r>
-        <w:rPr>
-          <w:b/>
-        </w:rPr>
-        <w:t>Build and test with Maven</w:t>
-      </w:r>
-      <w:r>
-        <w:t xml:space="preserve"> concluiu com sucesso no PR. Isso confirma que o projeto compilou e que os testes executados por Maven passaram; não confirma que o código é seguro.</w:t>
-      </w:r>
-    </w:p>
-    <w:p>
-      <w:pPr>
-        <w:pStyle w:val="ListBullet"/>
-      </w:pPr>
-      <w:r>
-        <w:t>O CodeQL / Code Scanning permaneceu desligado, conforme solicitado. Por isso, o GitHub não executou a análise CodeQL e não mostrou alerta de vulnerabilidade nesse PR.</w:t>
-      </w:r>
-    </w:p>
-    <w:p>
-      <w:pPr>
-        <w:pStyle w:val="ListBullet"/>
-      </w:pPr>
-      <w:r>
-        <w:t>A ausência do alerta é esperada porque o analisador estava desligado. Não é evidência de que o código vulnerável tenha passado por uma análise estática.</w:t>
-      </w:r>
-    </w:p>
-    <w:p>
-      <w:pPr>
-        <w:pStyle w:val="ListBullet"/>
-      </w:pPr>
-      <w:r>
-        <w:t>Não há reviewer atribuído: a revisão está pendente da mantenedora. Dependabot não é revisor humano; quando habilitado, pode abrir PRs de dependências, que ainda precisam de revisão.</w:t>
-      </w:r>
-    </w:p>
-    <w:p>
-      <w:pPr>
-        <w:pStyle w:val="ListBullet"/>
-      </w:pPr>
-      <w:r>
-        <w:t>A mantenedora decide se aprova e mescla. O assistente não aprova nem mescla PRs.</w:t>
-      </w:r>
-    </w:p>
-    <w:p>
-      <w:r>
-        <w:rPr>
-          <w:b/>
-        </w:rPr>
-        <w:t>Evidências no GitHub:</w:t>
-      </w:r>
-      <w:r>
-        <w:t xml:space="preserve"> </w:t>
-      </w:r>
-      <w:r>
-        <w:t>conversa e descrição do PR #9 — https://github.com/aeroschmidt/scanner-loja-instrumentos/pull/9</w:t>
-      </w:r>
-      <w:r>
-        <w:t xml:space="preserve">, </w:t>
-      </w:r>
-      <w:r>
-        <w:t>checks do PR #9 — https://github.com/aeroschmidt/scanner-loja-instrumentos/pull/9/checks</w:t>
-      </w:r>
-      <w:r>
-        <w:t xml:space="preserve"> e </w:t>
-      </w:r>
-      <w:r>
-        <w:t>execução do Actions #25 — https://github.com/aeroschmidt/scanner-loja-instrumentos/actions/runs/38097282398</w:t>
-      </w:r>
-      <w:r>
-        <w:t>. A Captura 4 é uma execução anterior do workflow, no PR #7; use os links do PR #9 para ver o resultado desta demonstração.</w:t>
-      </w:r>
-    </w:p>
-    <w:p>
-      <w:pPr>
-        <w:pStyle w:val="Heading2"/>
-      </w:pPr>
-      <w:r>
-        <w:t>Antes e depois: trecho que Code Scanning deve examinar</w:t>
-      </w:r>
-    </w:p>
-    <w:p>
-      <w:r>
-        <w:t xml:space="preserve">As duas figuras abaixo são visualizações legíveis dos trechos reais de </w:t>
-      </w:r>
-      <w:r>
-        <w:rPr>
-          <w:rFonts w:ascii="Consolas" w:hAnsi="Consolas"/>
-          <w:color w:val="5B2C83"/>
-          <w:sz w:val="18"/>
-        </w:rPr>
-        <w:t>ProductRepository.java</w:t>
-      </w:r>
-      <w:r>
-        <w:t xml:space="preserve">, comparando </w:t>
-      </w:r>
-      <w:r>
-        <w:rPr>
-          <w:rFonts w:ascii="Consolas" w:hAnsi="Consolas"/>
-          <w:color w:val="5B2C83"/>
-          <w:sz w:val="18"/>
-        </w:rPr>
-        <w:t>main</w:t>
-      </w:r>
-      <w:r>
-        <w:t xml:space="preserve"> com o código introduzido no PR #9. Elas não são capturas da interface do GitHub. O diff original e as linhas verificáveis estão em </w:t>
-      </w:r>
-      <w:r>
-        <w:t>Files changed no PR #9 — https://github.com/aeroschmidt/scanner-loja-instrumentos/pull/9/files</w:t>
-      </w:r>
-      <w:r>
-        <w:t>.</w:t>
-      </w:r>
-    </w:p>
-    <w:p>
-      <w:r>
-        <w:rPr>
-          <w:b/>
-        </w:rPr>
-        <w:t>Antes — `main`, linhas 32–36: busca parametrizada.</w:t>
-      </w:r>
-      <w:r>
-        <w:t xml:space="preserve"> O </w:t>
-      </w:r>
-      <w:r>
-        <w:rPr>
-          <w:rFonts w:ascii="Consolas" w:hAnsi="Consolas"/>
-          <w:color w:val="5B2C83"/>
-          <w:sz w:val="18"/>
-        </w:rPr>
-        <w:t>?</w:t>
-      </w:r>
-      <w:r>
-        <w:t xml:space="preserve"> ocupa o lugar do valor; </w:t>
-      </w:r>
-      <w:r>
-        <w:rPr>
-          <w:rFonts w:ascii="Consolas" w:hAnsi="Consolas"/>
-          <w:color w:val="5B2C83"/>
-          <w:sz w:val="18"/>
-        </w:rPr>
-        <w:t>name</w:t>
-      </w:r>
-      <w:r>
-        <w:t xml:space="preserve"> é passado separadamente como parâmetro. Isso evita montar SQL com o conteúdo recebido.</w:t>
-      </w:r>
-    </w:p>
-    <w:p>
-      <w:pPr>
-        <w:jc w:val="center"/>
-      </w:pPr>
-      <w:r>
-        <w:drawing>
-          <wp:inline xmlns:a="http://schemas.openxmlformats.org/drawingml/2006/main" xmlns:pic="http://schemas.openxmlformats.org/drawingml/2006/picture">
-            <wp:extent cx="5806440" cy="1664513"/>
-            <wp:docPr id="1" name="Picture 1"/>
-            <wp:cNvGraphicFramePr>
-              <a:graphicFrameLocks noChangeAspect="1"/>
-            </wp:cNvGraphicFramePr>
-            <a:graphic>
-              <a:graphicData uri="http://schemas.openxmlformats.org/drawingml/2006/picture">
-                <pic:pic>
-                  <pic:nvPicPr>
-                    <pic:cNvPr id="0" name="05-antes-busca-parametrizada.png"/>
-                    <pic:cNvPicPr/>
-                  </pic:nvPicPr>
-                  <pic:blipFill>
-                    <a:blip r:embed="rId11"/>
-                    <a:stretch>
-                      <a:fillRect/>
-                    </a:stretch>
-                  </pic:blipFill>
-                  <pic:spPr>
-                    <a:xfrm>
-                      <a:off x="0" y="0"/>
-                      <a:ext cx="5806440" cy="1664513"/>
-                    </a:xfrm>
-                    <a:prstGeom prst="rect"/>
-                  </pic:spPr>
-                </pic:pic>
-              </a:graphicData>
-            </a:graphic>
-          </wp:inline>
-        </w:drawing>
-      </w:r>
-    </w:p>
-    <w:p>
-      <w:pPr>
-        <w:pStyle w:val="Caption"/>
-        <w:jc w:val="center"/>
-      </w:pPr>
-      <w:r>
-        <w:t>Visualização do código antes: busca parametrizada na main, ProductRepository.java linhas 32 a 36</w:t>
-      </w:r>
-    </w:p>
-    <w:p>
-      <w:r>
-        <w:rPr>
-          <w:b/>
-        </w:rPr>
-        <w:t>Depois — PR #9, linhas 39–42: SQL Injection demonstrativa.</w:t>
-      </w:r>
-      <w:r>
-        <w:t xml:space="preserve"> A entrada externa chega pelo parâmetro </w:t>
-      </w:r>
-      <w:r>
-        <w:rPr>
-          <w:rFonts w:ascii="Consolas" w:hAnsi="Consolas"/>
-          <w:color w:val="5B2C83"/>
-          <w:sz w:val="18"/>
-        </w:rPr>
-        <w:t>name</w:t>
-      </w:r>
-      <w:r>
-        <w:t xml:space="preserve"> em </w:t>
-      </w:r>
-      <w:r>
-        <w:rPr>
-          <w:rFonts w:ascii="Consolas" w:hAnsi="Consolas"/>
-          <w:color w:val="5B2C83"/>
-          <w:sz w:val="18"/>
-        </w:rPr>
-        <w:t>ProductController.java</w:t>
-      </w:r>
-      <w:r>
-        <w:t xml:space="preserve">, linha 38. </w:t>
-      </w:r>
-      <w:r>
-        <w:rPr>
-          <w:rFonts w:ascii="Consolas" w:hAnsi="Consolas"/>
-          <w:color w:val="5B2C83"/>
-          <w:sz w:val="18"/>
-        </w:rPr>
-        <w:t>ProductRepository.java</w:t>
-      </w:r>
-      <w:r>
-        <w:t xml:space="preserve">, linha 41, concatena esse valor dentro da instrução SQL; a linha 42 envia a consulta montada para </w:t>
-      </w:r>
-      <w:r>
-        <w:rPr>
-          <w:rFonts w:ascii="Consolas" w:hAnsi="Consolas"/>
-          <w:color w:val="5B2C83"/>
-          <w:sz w:val="18"/>
-        </w:rPr>
-        <w:t>JdbcTemplate.query</w:t>
-      </w:r>
-      <w:r>
-        <w:t xml:space="preserve">. A rota de demonstração é </w:t>
-      </w:r>
-      <w:r>
-        <w:rPr>
-          <w:rFonts w:ascii="Consolas" w:hAnsi="Consolas"/>
-          <w:color w:val="5B2C83"/>
-          <w:sz w:val="18"/>
-        </w:rPr>
-        <w:t>/api/products/demo/sql-injection</w:t>
-      </w:r>
-      <w:r>
-        <w:t xml:space="preserve"> (linhas 37–40 do controller).</w:t>
-      </w:r>
-    </w:p>
-    <w:p>
-      <w:pPr>
-        <w:jc w:val="center"/>
-      </w:pPr>
-      <w:r>
-        <w:drawing>
-          <wp:inline xmlns:a="http://schemas.openxmlformats.org/drawingml/2006/main" xmlns:pic="http://schemas.openxmlformats.org/drawingml/2006/picture">
-            <wp:extent cx="5806440" cy="1664513"/>
-            <wp:docPr id="2" name="Picture 2"/>
-            <wp:cNvGraphicFramePr>
-              <a:graphicFrameLocks noChangeAspect="1"/>
-            </wp:cNvGraphicFramePr>
-            <a:graphic>
-              <a:graphicData uri="http://schemas.openxmlformats.org/drawingml/2006/picture">
-                <pic:pic>
-                  <pic:nvPicPr>
-                    <pic:cNvPr id="0" name="06-depois-concatenacao-sql.png"/>
-                    <pic:cNvPicPr/>
-                  </pic:nvPicPr>
-                  <pic:blipFill>
-                    <a:blip r:embed="rId12"/>
-                    <a:stretch>
-                      <a:fillRect/>
-                    </a:stretch>
-                  </pic:blipFill>
-                  <pic:spPr>
-                    <a:xfrm>
-                      <a:off x="0" y="0"/>
-                      <a:ext cx="5806440" cy="1664513"/>
-                    </a:xfrm>
-                    <a:prstGeom prst="rect"/>
-                  </pic:spPr>
-                </pic:pic>
-              </a:graphicData>
-            </a:graphic>
-          </wp:inline>
-        </w:drawing>
-      </w:r>
-    </w:p>
-    <w:p>
-      <w:pPr>
-        <w:pStyle w:val="Caption"/>
-        <w:jc w:val="center"/>
-      </w:pPr>
-      <w:r>
-        <w:t>Visualização do código depois: concatenação SQL no PR 9, ProductRepository.java linhas 39 a 42</w:t>
-      </w:r>
-    </w:p>
-    <w:p>
-      <w:r>
-        <w:rPr>
-          <w:b/>
-        </w:rPr>
-        <w:t>O que esperamos observar quando Code Scanning for ligado:</w:t>
-      </w:r>
-      <w:r>
-        <w:t xml:space="preserve"> se o CodeQL reconhecer o fluxo da entrada </w:t>
-      </w:r>
-      <w:r>
-        <w:rPr>
-          <w:rFonts w:ascii="Consolas" w:hAnsi="Consolas"/>
-          <w:color w:val="5B2C83"/>
-          <w:sz w:val="18"/>
-        </w:rPr>
-        <w:t>name</w:t>
-      </w:r>
-      <w:r>
-        <w:t xml:space="preserve"> até a consulta SQL, deverá registrar um alerta de SQL Injection associado ao trecho vulnerável, com arquivo, linha e explicação. O PR atual não confirma essa detecção: CodeQL está desligado. O resultado verde existente é somente do Maven; a compilação não detecta essa falha de segurança.</w:t>
-      </w:r>
-    </w:p>
-    <w:p>
-      <w:r>
-        <w:rPr>
-          <w:b/>
-        </w:rPr>
-        <w:t>“A análise encontrou” e “o PR bloqueou” são resultados diferentes.</w:t>
-      </w:r>
-      <w:r>
-        <w:t xml:space="preserve"> Um alerta/anotação ajuda a localizar o problema no diff. Para impedir merge, a administração também precisa exigir o check de Code Scanning nas regras de proteção da branch. Com CodeQL desligado, nem alerta nem check do CodeQL são esperados neste PR. Consulte </w:t>
-      </w:r>
-      <w:r>
-        <w:t>alertas de Code Scanning — https://docs.github.com/en/code-security/concepts/code-scanning/code-scanning-alerts</w:t>
-      </w:r>
-      <w:r>
-        <w:t xml:space="preserve">, </w:t>
-      </w:r>
-      <w:r>
-        <w:t>alertas em pull requests — https://docs.github.com/en/code-security/how-tos/manage-security-alerts/manage-code-scanning-alerts/triage-alerts-in-pull-requests</w:t>
-      </w:r>
-      <w:r>
-        <w:t xml:space="preserve"> e </w:t>
-      </w:r>
-      <w:r>
-        <w:t>checks obrigatórios — https://docs.github.com/en/pull-requests/reference/status-checks</w:t>
-      </w:r>
-      <w:r>
-        <w:t>.</w:t>
-      </w:r>
-    </w:p>
-    <w:p>
-      <w:r>
-        <w:rPr>
-          <w:b/>
-        </w:rPr>
-        <w:t>Versão segura de referência:</w:t>
-      </w:r>
-      <w:r>
-        <w:t xml:space="preserve"> mantenha a consulta parametrizada, como em </w:t>
-      </w:r>
-      <w:r>
-        <w:rPr>
-          <w:rFonts w:ascii="Consolas" w:hAnsi="Consolas"/>
-          <w:color w:val="5B2C83"/>
-          <w:sz w:val="18"/>
-        </w:rPr>
-        <w:t>searchByName</w:t>
-      </w:r>
-      <w:r>
-        <w:t xml:space="preserve"> nas linhas 32–36. Ao encerrar a demonstração, remova a rota e o método inseguros; não copie esse trecho para uma aplicação real.</w:t>
-      </w:r>
-    </w:p>
-    <w:p>
-      <w:pPr>
-        <w:pStyle w:val="Heading2"/>
-      </w:pPr>
-      <w:r>
-        <w:t>Como ler este PR</w:t>
-      </w:r>
-    </w:p>
-    <w:p>
-      <w:pPr>
-        <w:pStyle w:val="ListNumber"/>
-      </w:pPr>
-      <w:r>
-        <w:t xml:space="preserve">Na conversa, leia </w:t>
-      </w:r>
-      <w:r>
-        <w:rPr>
-          <w:b/>
-        </w:rPr>
-        <w:t>Objetivo</w:t>
-      </w:r>
-      <w:r>
-        <w:t xml:space="preserve">, </w:t>
-      </w:r>
-      <w:r>
-        <w:rPr>
-          <w:b/>
-        </w:rPr>
-        <w:t>Alteração</w:t>
-      </w:r>
-      <w:r>
-        <w:t xml:space="preserve">, </w:t>
-      </w:r>
-      <w:r>
-        <w:rPr>
-          <w:b/>
-        </w:rPr>
-        <w:t>O que observar</w:t>
-      </w:r>
-      <w:r>
-        <w:t xml:space="preserve"> e </w:t>
-      </w:r>
-      <w:r>
-        <w:rPr>
-          <w:b/>
-        </w:rPr>
-        <w:t>Revisão</w:t>
-      </w:r>
-      <w:r>
-        <w:t xml:space="preserve"> antes de olhar os checks.</w:t>
-      </w:r>
-    </w:p>
-    <w:p>
-      <w:pPr>
-        <w:pStyle w:val="ListNumber"/>
-      </w:pPr>
-      <w:r>
-        <w:t xml:space="preserve">Em </w:t>
-      </w:r>
-      <w:r>
-        <w:rPr>
-          <w:b/>
-        </w:rPr>
-        <w:t>Checks</w:t>
-      </w:r>
-      <w:r>
-        <w:t>, confirme que o job do Maven terminou com sucesso. Um check verde quer dizer que aquele job passou, dentro do que ele executa.</w:t>
-      </w:r>
-    </w:p>
-    <w:p>
-      <w:pPr>
-        <w:pStyle w:val="ListNumber"/>
-      </w:pPr>
-      <w:r>
-        <w:t>Confira quais checks aparecem no PR. Se a mantenedora não habilitou CodeQL, não espere alerta nem check de Code Scanning.</w:t>
-      </w:r>
-    </w:p>
-    <w:p>
-      <w:pPr>
-        <w:pStyle w:val="ListNumber"/>
-      </w:pPr>
-      <w:r>
-        <w:t xml:space="preserve">Em </w:t>
+        <w:t xml:space="preserve">Revise o diff em </w:t>
       </w:r>
       <w:r>
         <w:rPr>
@@ -816,18 +153,137 @@
         <w:t>Files changed</w:t>
       </w:r>
       <w:r>
-        <w:t xml:space="preserve">, localize </w:t>
+        <w:t xml:space="preserve"> e responda aos comentários. A aprovação e o merge seguem as regras da equipe.</w:t>
+      </w:r>
+    </w:p>
+    <w:p>
+      <w:pPr>
+        <w:pStyle w:val="Heading2"/>
+      </w:pPr>
+      <w:r>
+        <w:t>Como ler o estado de um check</w:t>
+      </w:r>
+    </w:p>
+    <w:p>
+      <w:pPr>
+        <w:pStyle w:val="ListBullet"/>
+      </w:pPr>
+      <w:r>
+        <w:rPr>
+          <w:b/>
+        </w:rPr>
+        <w:t>Em execução:</w:t>
       </w:r>
       <w:r>
+        <w:t xml:space="preserve"> o workflow ainda está trabalhando. Aguarde o resultado.</w:t>
+      </w:r>
+    </w:p>
+    <w:p>
+      <w:pPr>
+        <w:pStyle w:val="ListBullet"/>
+      </w:pPr>
+      <w:r>
         <w:rPr>
-          <w:rFonts w:ascii="Consolas" w:hAnsi="Consolas"/>
-          <w:color w:val="5B2C83"/>
-          <w:sz w:val="18"/>
+          <w:b/>
         </w:rPr>
-        <w:t>ProductRepository.java</w:t>
+        <w:t>Sucesso:</w:t>
       </w:r>
       <w:r>
-        <w:t xml:space="preserve"> nas linhas 39–42 e compare com a busca segura nas linhas 32–36. A visualização lado a lado acima resume essa alteração.</w:t>
+        <w:t xml:space="preserve"> as etapas daquele workflow passaram. Confira o que o workflow realmente executou; um build não substitui análise de segurança.</w:t>
+      </w:r>
+    </w:p>
+    <w:p>
+      <w:pPr>
+        <w:pStyle w:val="ListBullet"/>
+      </w:pPr>
+      <w:r>
+        <w:rPr>
+          <w:b/>
+        </w:rPr>
+        <w:t>Falha:</w:t>
+      </w:r>
+      <w:r>
+        <w:t xml:space="preserve"> uma etapa não passou ou encontrou uma condição que encerra o workflow. Abra o log para saber qual.</w:t>
+      </w:r>
+    </w:p>
+    <w:p>
+      <w:pPr>
+        <w:pStyle w:val="ListBullet"/>
+      </w:pPr>
+      <w:r>
+        <w:rPr>
+          <w:b/>
+        </w:rPr>
+        <w:t>Não aparece:</w:t>
+      </w:r>
+      <w:r>
+        <w:t xml:space="preserve"> a verificação pode não estar configurada para esse evento, branch ou linguagem, pode estar desligada ou não ser obrigatória. A ausência não significa que a análise passou.</w:t>
+      </w:r>
+    </w:p>
+    <w:p>
+      <w:pPr>
+        <w:pStyle w:val="ListBullet"/>
+      </w:pPr>
+      <w:r>
+        <w:rPr>
+          <w:b/>
+        </w:rPr>
+        <w:t>Pendente ou ignorado:</w:t>
+      </w:r>
+      <w:r>
+        <w:t xml:space="preserve"> verifique a explicação no GitHub e siga o processo da equipe. Não presuma que isso equivale a uma aprovação.</w:t>
+      </w:r>
+    </w:p>
+    <w:p>
+      <w:r>
+        <w:t>Checks podem vir de GitHub Actions, Code Scanning ou outros serviços. O nome e o propósito aparecem no próprio check.</w:t>
+      </w:r>
+    </w:p>
+    <w:p>
+      <w:pPr>
+        <w:pStyle w:val="Heading1"/>
+      </w:pPr>
+      <w:r>
+        <w:t>3. O que cada ferramenta indica para quem envia ou revisa PRs</w:t>
+      </w:r>
+    </w:p>
+    <w:p>
+      <w:pPr>
+        <w:pStyle w:val="Heading2"/>
+      </w:pPr>
+      <w:r>
+        <w:t>GitHub Actions</w:t>
+      </w:r>
+    </w:p>
+    <w:p>
+      <w:r>
+        <w:t>Actions executa os workflows definidos para eventos como abrir ou atualizar um PR. Um workflow pode compilar o projeto, rodar testes, verificar estilo ou executar outras tarefas. Consulte o resultado e os logs do job que corresponde à falha. Se o workflow está verde, conclua apenas que as tarefas configuradas nele passaram naquela execução.</w:t>
+      </w:r>
+    </w:p>
+    <w:p>
+      <w:pPr>
+        <w:pStyle w:val="Heading2"/>
+      </w:pPr>
+      <w:r>
+        <w:t>Code Scanning</w:t>
+      </w:r>
+    </w:p>
+    <w:p>
+      <w:r>
+        <w:t>Quando uma análise de código está configurada para o PR, ela pode exibir alertas e anotações com a regra, severidade, arquivo e trecho relacionado. Abra o alerta para entender o caminho do dado, o risco e a correção sugerida; depois confira o contexto completo no diff.</w:t>
+      </w:r>
+    </w:p>
+    <w:p>
+      <w:r>
+        <w:t>Um alerta não significa automaticamente que o merge será bloqueado. Isso depende das regras de proteção e da configuração do check. Da mesma forma, nenhum alerta pode significar que a análise não encontrou problemas que reconhece, que não foi executada ou que não cobre aquele caso. Considere a linguagem, o tipo de análise e o código efetivamente analisado.</w:t>
+      </w:r>
+    </w:p>
+    <w:p>
+      <w:r>
+        <w:rPr>
+          <w:b/>
+        </w:rPr>
+        <w:t>Ao encontrar um alerta:</w:t>
       </w:r>
     </w:p>
     <w:p>
@@ -835,7 +291,494 @@
         <w:pStyle w:val="ListNumber"/>
       </w:pPr>
       <w:r>
-        <w:t>Não aprove nem mescle este PR enquanto a rota vulnerável estiver presente. A mantenedora deve decidir o próximo passo do exercício.</w:t>
+        <w:t>Leia a descrição, severidade, arquivo e linha indicados.</w:t>
+      </w:r>
+    </w:p>
+    <w:p>
+      <w:pPr>
+        <w:pStyle w:val="ListNumber"/>
+      </w:pPr>
+      <w:r>
+        <w:t>Entenda se o achado é real no contexto da mudança; não descarte apenas porque o build passou.</w:t>
+      </w:r>
+    </w:p>
+    <w:p>
+      <w:pPr>
+        <w:pStyle w:val="ListNumber"/>
+      </w:pPr>
+      <w:r>
+        <w:t>Corrija a origem do problema e acrescente ou ajuste testes quando fizer sentido.</w:t>
+      </w:r>
+    </w:p>
+    <w:p>
+      <w:pPr>
+        <w:pStyle w:val="ListNumber"/>
+      </w:pPr>
+      <w:r>
+        <w:t>Envie a correção e confira a nova análise. Se considerar o alerta incorreto, siga o processo da equipe para justificar e solicitar triagem; não o oculte sem explicação.</w:t>
+      </w:r>
+    </w:p>
+    <w:p>
+      <w:pPr>
+        <w:pStyle w:val="Heading2"/>
+      </w:pPr>
+      <w:r>
+        <w:t>Dependabot</w:t>
+      </w:r>
+    </w:p>
+    <w:p>
+      <w:r>
+        <w:t xml:space="preserve">Dependabot pode abrir PRs de </w:t>
+      </w:r>
+      <w:r>
+        <w:rPr>
+          <w:b/>
+        </w:rPr>
+        <w:t>atualização de segurança</w:t>
+      </w:r>
+      <w:r>
+        <w:t xml:space="preserve"> para dependências vulneráveis ou de </w:t>
+      </w:r>
+      <w:r>
+        <w:rPr>
+          <w:b/>
+        </w:rPr>
+        <w:t>atualização de versão</w:t>
+      </w:r>
+      <w:r>
+        <w:t xml:space="preserve"> para manter dependências atualizadas. O PR normalmente identifica a dependência e a versão proposta, e pode incluir informações sobre a atualização.</w:t>
+      </w:r>
+    </w:p>
+    <w:p>
+      <w:r>
+        <w:t>Trate-o como uma alteração de código: confira o diff, o motivo da atualização, a compatibilidade e os checks. Veja notas de versão quando uma atualização puder alterar comportamento. Um PR criado pelo Dependabot não é uma aprovação humana; siga o processo normal de revisão e aprovação.</w:t>
+      </w:r>
+    </w:p>
+    <w:p>
+      <w:pPr>
+        <w:pStyle w:val="Heading2"/>
+      </w:pPr>
+      <w:r>
+        <w:t>Secret Scanning e Push Protection</w:t>
+      </w:r>
+    </w:p>
+    <w:p>
+      <w:r>
+        <w:t>Secret Scanning procura padrões de credenciais expostas no repositório e pode gerar alertas. Push Protection pode bloquear um envio quando detecta um possível segredo, conforme a configuração aplicada.</w:t>
+      </w:r>
+    </w:p>
+    <w:p>
+      <w:r>
+        <w:rPr>
+          <w:b/>
+        </w:rPr>
+        <w:t>Se o envio for bloqueado:</w:t>
+      </w:r>
+    </w:p>
+    <w:p>
+      <w:pPr>
+        <w:pStyle w:val="ListNumber"/>
+      </w:pPr>
+      <w:r>
+        <w:t>Não coloque uma credencial real em um PR ou commit de teste.</w:t>
+      </w:r>
+    </w:p>
+    <w:p>
+      <w:pPr>
+        <w:pStyle w:val="ListNumber"/>
+      </w:pPr>
+      <w:r>
+        <w:t>Remova o valor do código e use o mecanismo de armazenamento aprovado pela equipe.</w:t>
+      </w:r>
+    </w:p>
+    <w:p>
+      <w:pPr>
+        <w:pStyle w:val="ListNumber"/>
+      </w:pPr>
+      <w:r>
+        <w:t>Se a credencial for verdadeira ou tiver sido exposta, avise imediatamente o responsável e revogue ou rotacione o segredo. Apagar o texto do commit, sozinho, não invalida uma credencial que já foi exposta.</w:t>
+      </w:r>
+    </w:p>
+    <w:p>
+      <w:pPr>
+        <w:pStyle w:val="ListNumber"/>
+      </w:pPr>
+      <w:r>
+        <w:t>Só use uma opção de bypass se a política da organização permitir e houver justificativa aprovada. O bypass pode registrar um alerta e não deve servir para contornar a correção.</w:t>
+      </w:r>
+    </w:p>
+    <w:p>
+      <w:r>
+        <w:t>Se o padrão detectado for um falso positivo ou um valor de teste sem validade, siga o procedimento definido pelos administradores para revisar o bloqueio.</w:t>
+      </w:r>
+    </w:p>
+    <w:p>
+      <w:pPr>
+        <w:pStyle w:val="Heading1"/>
+      </w:pPr>
+      <w:r>
+        <w:t>4. Alerta encontrado versus merge bloqueado</w:t>
+      </w:r>
+    </w:p>
+    <w:p>
+      <w:r>
+        <w:t>O GitHub pode mostrar um alerta para ajudar a equipe a localizar um problema sem impedir o merge. Para bloquear o merge, o repositório precisa exigir o check relevante ou outra regra aplicável. O usuário deve:</w:t>
+      </w:r>
+    </w:p>
+    <w:p>
+      <w:pPr>
+        <w:pStyle w:val="ListNumber"/>
+      </w:pPr>
+      <w:r>
+        <w:t>verificar se o resultado está concluído e qual ferramenta o produziu;</w:t>
+      </w:r>
+    </w:p>
+    <w:p>
+      <w:pPr>
+        <w:pStyle w:val="ListNumber"/>
+      </w:pPr>
+      <w:r>
+        <w:t>abrir os detalhes do alerta ou do check e entender a ação esperada;</w:t>
+      </w:r>
+    </w:p>
+    <w:p>
+      <w:pPr>
+        <w:pStyle w:val="ListNumber"/>
+      </w:pPr>
+      <w:r>
+        <w:t>corrigir o problema ou encaminhar a triagem conforme a política da equipe;</w:t>
+      </w:r>
+    </w:p>
+    <w:p>
+      <w:pPr>
+        <w:pStyle w:val="ListNumber"/>
+      </w:pPr>
+      <w:r>
+        <w:t>confirmar que a nova execução reflete a correção;</w:t>
+      </w:r>
+    </w:p>
+    <w:p>
+      <w:pPr>
+        <w:pStyle w:val="ListNumber"/>
+      </w:pPr>
+      <w:r>
+        <w:t>aguardar as aprovações exigidas antes do merge.</w:t>
+      </w:r>
+    </w:p>
+    <w:p>
+      <w:r>
+        <w:t>Não trate “sem check”, “check verde” e “alerta resolvido” como estados equivalentes.</w:t>
+      </w:r>
+    </w:p>
+    <w:p>
+      <w:pPr>
+        <w:pStyle w:val="Heading1"/>
+      </w:pPr>
+      <w:r>
+        <w:t>5. Exercícios controlados para aprender as ferramentas</w:t>
+      </w:r>
+    </w:p>
+    <w:p>
+      <w:r>
+        <w:t>Uma equipe pode comparar o resultado de uma mudança segura com o de uma vulnerabilidade intencional para entender o que uma análise detecta. Isso deve ocorrer em uma branch ou repositório de laboratório, com dados fictícios e sob supervisão. Nunca introduza credenciais válidas ou código inseguro em uma branch de produção.</w:t>
+      </w:r>
+    </w:p>
+    <w:p>
+      <w:r>
+        <w:t>Para cada exercício:</w:t>
+      </w:r>
+    </w:p>
+    <w:p>
+      <w:pPr>
+        <w:pStyle w:val="ListNumber"/>
+      </w:pPr>
+      <w:r>
+        <w:t>registre o estado inicial e quais verificações estão ativas;</w:t>
+      </w:r>
+    </w:p>
+    <w:p>
+      <w:pPr>
+        <w:pStyle w:val="ListNumber"/>
+      </w:pPr>
+      <w:r>
+        <w:t>faça uma única alteração controlada e descreva o comportamento esperado;</w:t>
+      </w:r>
+    </w:p>
+    <w:p>
+      <w:pPr>
+        <w:pStyle w:val="ListNumber"/>
+      </w:pPr>
+      <w:r>
+        <w:t>abra um PR e observe os checks e alertas sem presumir que a ferramenta necessariamente reconhecerá o caso;</w:t>
+      </w:r>
+    </w:p>
+    <w:p>
+      <w:pPr>
+        <w:pStyle w:val="ListNumber"/>
+      </w:pPr>
+      <w:r>
+        <w:t>compare o resultado com o que a análise realmente executou e com o diff;</w:t>
+      </w:r>
+    </w:p>
+    <w:p>
+      <w:pPr>
+        <w:pStyle w:val="ListNumber"/>
+      </w:pPr>
+      <w:r>
+        <w:t>remova o código inseguro, confirme a nova análise e não faça merge enquanto o risco estiver presente.</w:t>
+      </w:r>
+    </w:p>
+    <w:p>
+      <w:r>
+        <w:t>Uma ferramenta pode não reconhecer um exemplo por limitações de linguagem, configuração, regras selecionadas ou contexto analisado. A finalidade do exercício é aprender o alcance e os limites da verificação, não declarar o código seguro por ausência de alertas.</w:t>
+      </w:r>
+    </w:p>
+    <w:p>
+      <w:pPr>
+        <w:pStyle w:val="Heading1"/>
+      </w:pPr>
+      <w:r>
+        <w:t>6. Modelo de descrição para PR</w:t>
+      </w:r>
+    </w:p>
+    <w:p>
+      <w:r>
+        <w:t>Adapte este roteiro ao padrão da equipe:</w:t>
+      </w:r>
+    </w:p>
+    <w:p>
+      <w:pPr>
+        <w:pStyle w:val="ListBullet"/>
+      </w:pPr>
+      <w:r>
+        <w:rPr>
+          <w:b/>
+        </w:rPr>
+        <w:t>Objetivo:</w:t>
+      </w:r>
+      <w:r>
+        <w:t xml:space="preserve"> qual necessidade esta mudança atende?</w:t>
+      </w:r>
+    </w:p>
+    <w:p>
+      <w:pPr>
+        <w:pStyle w:val="ListBullet"/>
+      </w:pPr>
+      <w:r>
+        <w:rPr>
+          <w:b/>
+        </w:rPr>
+        <w:t>Alterações:</w:t>
+      </w:r>
+      <w:r>
+        <w:t xml:space="preserve"> o que foi modificado?</w:t>
+      </w:r>
+    </w:p>
+    <w:p>
+      <w:pPr>
+        <w:pStyle w:val="ListBullet"/>
+      </w:pPr>
+      <w:r>
+        <w:rPr>
+          <w:b/>
+        </w:rPr>
+        <w:t>Verificação:</w:t>
+      </w:r>
+      <w:r>
+        <w:t xml:space="preserve"> quais testes ou checks foram executados?</w:t>
+      </w:r>
+    </w:p>
+    <w:p>
+      <w:pPr>
+        <w:pStyle w:val="ListBullet"/>
+      </w:pPr>
+      <w:r>
+        <w:rPr>
+          <w:b/>
+        </w:rPr>
+        <w:t>Segurança:</w:t>
+      </w:r>
+      <w:r>
+        <w:t xml:space="preserve"> há alertas, dados sensíveis ou riscos que o revisor deve avaliar?</w:t>
+      </w:r>
+    </w:p>
+    <w:p>
+      <w:pPr>
+        <w:pStyle w:val="ListBullet"/>
+      </w:pPr>
+      <w:r>
+        <w:rPr>
+          <w:b/>
+        </w:rPr>
+        <w:t>Revisão:</w:t>
+      </w:r>
+      <w:r>
+        <w:t xml:space="preserve"> há algum ponto específico que precisa de atenção?</w:t>
+      </w:r>
+    </w:p>
+    <w:p>
+      <w:r>
+        <w:t>Não inclua tokens, senhas, dados pessoais ou segredos nos exemplos, na descrição ou nos comentários do PR.</w:t>
+      </w:r>
+    </w:p>
+    <w:p>
+      <w:pPr>
+        <w:pStyle w:val="Heading1"/>
+      </w:pPr>
+      <w:r>
+        <w:t>7. Checklist rápido</w:t>
+      </w:r>
+    </w:p>
+    <w:p>
+      <w:pPr>
+        <w:pStyle w:val="Heading2"/>
+      </w:pPr>
+      <w:r>
+        <w:t>Para quem abre o PR</w:t>
+      </w:r>
+    </w:p>
+    <w:p>
+      <w:pPr>
+        <w:pStyle w:val="ListBullet"/>
+      </w:pPr>
+      <w:r>
+        <w:t>[ ] O título e a descrição explicam a mudança.</w:t>
+      </w:r>
+    </w:p>
+    <w:p>
+      <w:pPr>
+        <w:pStyle w:val="ListBullet"/>
+      </w:pPr>
+      <w:r>
+        <w:t>[ ] O diff contém somente o escopo esperado.</w:t>
+      </w:r>
+    </w:p>
+    <w:p>
+      <w:pPr>
+        <w:pStyle w:val="ListBullet"/>
+      </w:pPr>
+      <w:r>
+        <w:t>[ ] Os checks terminaram e as falhas foram investigadas.</w:t>
+      </w:r>
+    </w:p>
+    <w:p>
+      <w:pPr>
+        <w:pStyle w:val="ListBullet"/>
+      </w:pPr>
+      <w:r>
+        <w:t>[ ] Alertas de segurança foram tratados ou encaminhados com justificativa.</w:t>
+      </w:r>
+    </w:p>
+    <w:p>
+      <w:pPr>
+        <w:pStyle w:val="ListBullet"/>
+      </w:pPr>
+      <w:r>
+        <w:t>[ ] Nenhuma credencial real foi incluída.</w:t>
+      </w:r>
+    </w:p>
+    <w:p>
+      <w:pPr>
+        <w:pStyle w:val="ListBullet"/>
+      </w:pPr>
+      <w:r>
+        <w:t>[ ] As revisões e aprovações necessárias foram solicitadas.</w:t>
+      </w:r>
+    </w:p>
+    <w:p>
+      <w:pPr>
+        <w:pStyle w:val="Heading2"/>
+      </w:pPr>
+      <w:r>
+        <w:t>Para quem revisa</w:t>
+      </w:r>
+    </w:p>
+    <w:p>
+      <w:pPr>
+        <w:pStyle w:val="ListBullet"/>
+      </w:pPr>
+      <w:r>
+        <w:t>[ ] O diff corresponde ao objetivo informado.</w:t>
+      </w:r>
+    </w:p>
+    <w:p>
+      <w:pPr>
+        <w:pStyle w:val="ListBullet"/>
+      </w:pPr>
+      <w:r>
+        <w:t>[ ] Os checks importantes foram executados e seus resultados foram entendidos.</w:t>
+      </w:r>
+    </w:p>
+    <w:p>
+      <w:pPr>
+        <w:pStyle w:val="ListBullet"/>
+      </w:pPr>
+      <w:r>
+        <w:t>[ ] Alterações de dependências foram avaliadas quanto a segurança e compatibilidade.</w:t>
+      </w:r>
+    </w:p>
+    <w:p>
+      <w:pPr>
+        <w:pStyle w:val="ListBullet"/>
+      </w:pPr>
+      <w:r>
+        <w:t>[ ] Alertas e possíveis segredos foram tratados conforme a política da equipe.</w:t>
+      </w:r>
+    </w:p>
+    <w:p>
+      <w:pPr>
+        <w:pStyle w:val="ListBullet"/>
+      </w:pPr>
+      <w:r>
+        <w:t>[ ] A aprovação considera o código e as regras do repositório; status verde isolado não substitui revisão.</w:t>
+      </w:r>
+    </w:p>
+    <w:p>
+      <w:pPr>
+        <w:pStyle w:val="Heading1"/>
+      </w:pPr>
+      <w:r>
+        <w:t>8. Referências oficiais</w:t>
+      </w:r>
+    </w:p>
+    <w:p>
+      <w:pPr>
+        <w:pStyle w:val="ListBullet"/>
+      </w:pPr>
+      <w:r>
+        <w:t>GitHub Actions: entender workflows — https://docs.github.com/en/actions/about-github-actions/understanding-github-actions</w:t>
+      </w:r>
+    </w:p>
+    <w:p>
+      <w:pPr>
+        <w:pStyle w:val="ListBullet"/>
+      </w:pPr>
+      <w:r>
+        <w:t>Code Scanning: alertas e resultados em Pull Requests — https://docs.github.com/en/code-security/concepts/code-scanning/code-scanning-alerts</w:t>
+      </w:r>
+    </w:p>
+    <w:p>
+      <w:pPr>
+        <w:pStyle w:val="ListBullet"/>
+      </w:pPr>
+      <w:r>
+        <w:t>Checks de status e regras de branch — https://docs.github.com/en/pull-requests/reference/status-checks</w:t>
+      </w:r>
+    </w:p>
+    <w:p>
+      <w:pPr>
+        <w:pStyle w:val="ListBullet"/>
+      </w:pPr>
+      <w:r>
+        <w:t>Revisar PRs do Dependabot — https://docs.github.com/en/code-security/how-tos/secure-your-supply-chain/manage-your-dependency-security/manage-dependabot-prs</w:t>
+      </w:r>
+    </w:p>
+    <w:p>
+      <w:pPr>
+        <w:pStyle w:val="ListBullet"/>
+      </w:pPr>
+      <w:r>
+        <w:t>Secret Scanning e prevenção de vazamentos — https://docs.github.com/en/code-security/how-tos/secure-your-secrets/prevent-future-leaks</w:t>
       </w:r>
     </w:p>
     <w:sectPr>
@@ -858,7 +801,7 @@
       <w:jc w:val="center"/>
     </w:pPr>
     <w:r>
-      <w:t>Trilha de aprendizado • Atualizado em 10/10/2026</w:t>
+      <w:t>Fluxo de contribuição e verificações de segurança no GitHub</w:t>
     </w:r>
   </w:p>
 </w:ftr>
@@ -872,7 +815,7 @@
       <w:jc w:val="right"/>
     </w:pPr>
     <w:r>
-      <w:t>SOM &amp; CORDA  |  GUIA OPERACIONAL</w:t>
+      <w:t>GUIA DO USUÁRIO  |  PULL REQUESTS E VERIFICAÇÕES</w:t>
     </w:r>
   </w:p>
 </w:hdr>

</xml_diff>

<commit_message>
Document PR behavior with screenshots
</commit_message>
<xml_diff>
--- a/docs/guia-usuario-prs.docx
+++ b/docs/guia-usuario-prs.docx
@@ -781,6 +781,738 @@
         <w:t>Secret Scanning e prevenção de vazamentos — https://docs.github.com/en/code-security/how-tos/secure-your-secrets/prevent-future-leaks</w:t>
       </w:r>
     </w:p>
+    <w:p>
+      <w:pPr>
+        <w:pStyle w:val="Heading1"/>
+      </w:pPr>
+      <w:r>
+        <w:t>9. Estudo de caso visual dos PRs</w:t>
+      </w:r>
+    </w:p>
+    <w:p>
+      <w:r>
+        <w:t>As telas abaixo registram exercícios deste laboratório em 10/10/2026. Elas mostram resultados observados, não uma promessa de que toda configuração de repositório produzirá os mesmos checks. Os números dos PRs são referências do exercício; em outro repositório, siga os mesmos passos sem depender desses números.</w:t>
+      </w:r>
+    </w:p>
+    <w:p>
+      <w:pPr>
+        <w:pStyle w:val="Heading2"/>
+      </w:pPr>
+      <w:r>
+        <w:t>PR comum sem Code Scanning</w:t>
+      </w:r>
+    </w:p>
+    <w:p>
+      <w:r>
+        <w:t xml:space="preserve">O </w:t>
+      </w:r>
+      <w:r>
+        <w:t>PR #8 — https://github.com/aeroschmidt/scanner-loja-instrumentos/pull/8</w:t>
+      </w:r>
+      <w:r>
+        <w:t xml:space="preserve"> é a referência de um PR pequeno, sem código vulnerável: alterou apenas documentação. A conversa mostra o objetivo, o estado aberto e a ausência de revisões; o painel de checks mostra o workflow </w:t>
+      </w:r>
+      <w:r>
+        <w:rPr>
+          <w:b/>
+        </w:rPr>
+        <w:t>Build and test</w:t>
+      </w:r>
+      <w:r>
+        <w:t xml:space="preserve"> concluído com sucesso. Em </w:t>
+      </w:r>
+      <w:r>
+        <w:rPr>
+          <w:b/>
+        </w:rPr>
+        <w:t>Files changed</w:t>
+      </w:r>
+      <w:r>
+        <w:t xml:space="preserve">, o único arquivo é </w:t>
+      </w:r>
+      <w:r>
+        <w:rPr>
+          <w:rFonts w:ascii="Consolas" w:hAnsi="Consolas"/>
+          <w:color w:val="5B2C83"/>
+          <w:sz w:val="18"/>
+        </w:rPr>
+        <w:t>README.md</w:t>
+      </w:r>
+      <w:r>
+        <w:t>.</w:t>
+      </w:r>
+    </w:p>
+    <w:p>
+      <w:pPr>
+        <w:jc w:val="center"/>
+      </w:pPr>
+      <w:r>
+        <w:drawing>
+          <wp:inline xmlns:a="http://schemas.openxmlformats.org/drawingml/2006/main" xmlns:pic="http://schemas.openxmlformats.org/drawingml/2006/picture">
+            <wp:extent cx="5806440" cy="3268131"/>
+            <wp:docPr id="1" name="Picture 1"/>
+            <wp:cNvGraphicFramePr>
+              <a:graphicFrameLocks noChangeAspect="1"/>
+            </wp:cNvGraphicFramePr>
+            <a:graphic>
+              <a:graphicData uri="http://schemas.openxmlformats.org/drawingml/2006/picture">
+                <pic:pic>
+                  <pic:nvPicPr>
+                    <pic:cNvPr id="0" name="pr8-overview.jpg"/>
+                    <pic:cNvPicPr/>
+                  </pic:nvPicPr>
+                  <pic:blipFill>
+                    <a:blip r:embed="rId11"/>
+                    <a:stretch>
+                      <a:fillRect/>
+                    </a:stretch>
+                  </pic:blipFill>
+                  <pic:spPr>
+                    <a:xfrm>
+                      <a:off x="0" y="0"/>
+                      <a:ext cx="5806440" cy="3268131"/>
+                    </a:xfrm>
+                    <a:prstGeom prst="rect"/>
+                  </pic:spPr>
+                </pic:pic>
+              </a:graphicData>
+            </a:graphic>
+          </wp:inline>
+        </w:drawing>
+      </w:r>
+    </w:p>
+    <w:p>
+      <w:pPr>
+        <w:pStyle w:val="Caption"/>
+        <w:jc w:val="center"/>
+      </w:pPr>
+      <w:r>
+        <w:t>PR comum aberto: descrição, estado e revisão pendente</w:t>
+      </w:r>
+    </w:p>
+    <w:p>
+      <w:pPr>
+        <w:jc w:val="center"/>
+      </w:pPr>
+      <w:r>
+        <w:drawing>
+          <wp:inline xmlns:a="http://schemas.openxmlformats.org/drawingml/2006/main" xmlns:pic="http://schemas.openxmlformats.org/drawingml/2006/picture">
+            <wp:extent cx="5806440" cy="3268131"/>
+            <wp:docPr id="2" name="Picture 2"/>
+            <wp:cNvGraphicFramePr>
+              <a:graphicFrameLocks noChangeAspect="1"/>
+            </wp:cNvGraphicFramePr>
+            <a:graphic>
+              <a:graphicData uri="http://schemas.openxmlformats.org/drawingml/2006/picture">
+                <pic:pic>
+                  <pic:nvPicPr>
+                    <pic:cNvPr id="0" name="pr8-checks.jpg"/>
+                    <pic:cNvPicPr/>
+                  </pic:nvPicPr>
+                  <pic:blipFill>
+                    <a:blip r:embed="rId12"/>
+                    <a:stretch>
+                      <a:fillRect/>
+                    </a:stretch>
+                  </pic:blipFill>
+                  <pic:spPr>
+                    <a:xfrm>
+                      <a:off x="0" y="0"/>
+                      <a:ext cx="5806440" cy="3268131"/>
+                    </a:xfrm>
+                    <a:prstGeom prst="rect"/>
+                  </pic:spPr>
+                </pic:pic>
+              </a:graphicData>
+            </a:graphic>
+          </wp:inline>
+        </w:drawing>
+      </w:r>
+    </w:p>
+    <w:p>
+      <w:pPr>
+        <w:pStyle w:val="Caption"/>
+        <w:jc w:val="center"/>
+      </w:pPr>
+      <w:r>
+        <w:t>PR comum: check de Build and test concluído com sucesso</w:t>
+      </w:r>
+    </w:p>
+    <w:p>
+      <w:pPr>
+        <w:jc w:val="center"/>
+      </w:pPr>
+      <w:r>
+        <w:drawing>
+          <wp:inline xmlns:a="http://schemas.openxmlformats.org/drawingml/2006/main" xmlns:pic="http://schemas.openxmlformats.org/drawingml/2006/picture">
+            <wp:extent cx="5806440" cy="3268131"/>
+            <wp:docPr id="3" name="Picture 3"/>
+            <wp:cNvGraphicFramePr>
+              <a:graphicFrameLocks noChangeAspect="1"/>
+            </wp:cNvGraphicFramePr>
+            <a:graphic>
+              <a:graphicData uri="http://schemas.openxmlformats.org/drawingml/2006/picture">
+                <pic:pic>
+                  <pic:nvPicPr>
+                    <pic:cNvPr id="0" name="pr8-files.jpg"/>
+                    <pic:cNvPicPr/>
+                  </pic:nvPicPr>
+                  <pic:blipFill>
+                    <a:blip r:embed="rId13"/>
+                    <a:stretch>
+                      <a:fillRect/>
+                    </a:stretch>
+                  </pic:blipFill>
+                  <pic:spPr>
+                    <a:xfrm>
+                      <a:off x="0" y="0"/>
+                      <a:ext cx="5806440" cy="3268131"/>
+                    </a:xfrm>
+                    <a:prstGeom prst="rect"/>
+                  </pic:spPr>
+                </pic:pic>
+              </a:graphicData>
+            </a:graphic>
+          </wp:inline>
+        </w:drawing>
+      </w:r>
+    </w:p>
+    <w:p>
+      <w:pPr>
+        <w:pStyle w:val="Caption"/>
+        <w:jc w:val="center"/>
+      </w:pPr>
+      <w:r>
+        <w:t>PR comum: o diff altera apenas o README</w:t>
+      </w:r>
+    </w:p>
+    <w:p>
+      <w:r>
+        <w:t>O resultado verde confirma somente que o workflow configurado passou. Nesse exemplo, não havia Code Scanning executando; portanto, não se deve concluir que o código foi analisado por segurança.</w:t>
+      </w:r>
+    </w:p>
+    <w:p>
+      <w:pPr>
+        <w:pStyle w:val="Heading2"/>
+      </w:pPr>
+      <w:r>
+        <w:t>PR atual com SQL Injection intencional</w:t>
+      </w:r>
+    </w:p>
+    <w:p>
+      <w:r>
+        <w:t xml:space="preserve">O </w:t>
+      </w:r>
+      <w:r>
+        <w:t>PR #9 — https://github.com/aeroschmidt/scanner-loja-instrumentos/pull/9</w:t>
+      </w:r>
+      <w:r>
+        <w:t xml:space="preserve"> é um exercício isolado para visualizar uma vulnerabilidade. </w:t>
+      </w:r>
+      <w:r>
+        <w:rPr>
+          <w:b/>
+        </w:rPr>
+        <w:t>Não aprove nem faça merge deste PR:</w:t>
+      </w:r>
+      <w:r>
+        <w:t xml:space="preserve"> a alteração insegura foi mantida de propósito para a demonstração. A página mostra a descrição e o estado atual do PR; a área de checks mostra execuções do workflow Maven, mas não mostra um check do CodeQL. A aba </w:t>
+      </w:r>
+      <w:r>
+        <w:rPr>
+          <w:b/>
+        </w:rPr>
+        <w:t>Files changed</w:t>
+      </w:r>
+      <w:r>
+        <w:t xml:space="preserve"> mostra o diff real.</w:t>
+      </w:r>
+    </w:p>
+    <w:p>
+      <w:pPr>
+        <w:jc w:val="center"/>
+      </w:pPr>
+      <w:r>
+        <w:drawing>
+          <wp:inline xmlns:a="http://schemas.openxmlformats.org/drawingml/2006/main" xmlns:pic="http://schemas.openxmlformats.org/drawingml/2006/picture">
+            <wp:extent cx="5806440" cy="3268131"/>
+            <wp:docPr id="4" name="Picture 4"/>
+            <wp:cNvGraphicFramePr>
+              <a:graphicFrameLocks noChangeAspect="1"/>
+            </wp:cNvGraphicFramePr>
+            <a:graphic>
+              <a:graphicData uri="http://schemas.openxmlformats.org/drawingml/2006/picture">
+                <pic:pic>
+                  <pic:nvPicPr>
+                    <pic:cNvPr id="0" name="pr9-overview.jpg"/>
+                    <pic:cNvPicPr/>
+                  </pic:nvPicPr>
+                  <pic:blipFill>
+                    <a:blip r:embed="rId14"/>
+                    <a:stretch>
+                      <a:fillRect/>
+                    </a:stretch>
+                  </pic:blipFill>
+                  <pic:spPr>
+                    <a:xfrm>
+                      <a:off x="0" y="0"/>
+                      <a:ext cx="5806440" cy="3268131"/>
+                    </a:xfrm>
+                    <a:prstGeom prst="rect"/>
+                  </pic:spPr>
+                </pic:pic>
+              </a:graphicData>
+            </a:graphic>
+          </wp:inline>
+        </w:drawing>
+      </w:r>
+    </w:p>
+    <w:p>
+      <w:pPr>
+        <w:pStyle w:val="Caption"/>
+        <w:jc w:val="center"/>
+      </w:pPr>
+      <w:r>
+        <w:t>PR de laboratório aberto: objetivo, escopo e estado atual</w:t>
+      </w:r>
+    </w:p>
+    <w:p>
+      <w:pPr>
+        <w:jc w:val="center"/>
+      </w:pPr>
+      <w:r>
+        <w:drawing>
+          <wp:inline xmlns:a="http://schemas.openxmlformats.org/drawingml/2006/main" xmlns:pic="http://schemas.openxmlformats.org/drawingml/2006/picture">
+            <wp:extent cx="5806440" cy="3268131"/>
+            <wp:docPr id="5" name="Picture 5"/>
+            <wp:cNvGraphicFramePr>
+              <a:graphicFrameLocks noChangeAspect="1"/>
+            </wp:cNvGraphicFramePr>
+            <a:graphic>
+              <a:graphicData uri="http://schemas.openxmlformats.org/drawingml/2006/picture">
+                <pic:pic>
+                  <pic:nvPicPr>
+                    <pic:cNvPr id="0" name="pr9-checks.jpg"/>
+                    <pic:cNvPicPr/>
+                  </pic:nvPicPr>
+                  <pic:blipFill>
+                    <a:blip r:embed="rId15"/>
+                    <a:stretch>
+                      <a:fillRect/>
+                    </a:stretch>
+                  </pic:blipFill>
+                  <pic:spPr>
+                    <a:xfrm>
+                      <a:off x="0" y="0"/>
+                      <a:ext cx="5806440" cy="3268131"/>
+                    </a:xfrm>
+                    <a:prstGeom prst="rect"/>
+                  </pic:spPr>
+                </pic:pic>
+              </a:graphicData>
+            </a:graphic>
+          </wp:inline>
+        </w:drawing>
+      </w:r>
+    </w:p>
+    <w:p>
+      <w:pPr>
+        <w:pStyle w:val="Caption"/>
+        <w:jc w:val="center"/>
+      </w:pPr>
+      <w:r>
+        <w:t>PR de laboratório: checks de Build and test, sem check de CodeQL</w:t>
+      </w:r>
+    </w:p>
+    <w:p>
+      <w:r>
+        <w:t xml:space="preserve">Na aplicação, a busca normal continua usando consulta parametrizada. A demonstração acrescenta uma rota separada em </w:t>
+      </w:r>
+      <w:r>
+        <w:rPr>
+          <w:rFonts w:ascii="Consolas" w:hAnsi="Consolas"/>
+          <w:color w:val="5B2C83"/>
+          <w:sz w:val="18"/>
+        </w:rPr>
+        <w:t>ProductController.java</w:t>
+      </w:r>
+      <w:r>
+        <w:t xml:space="preserve"> (</w:t>
+      </w:r>
+      <w:r>
+        <w:rPr>
+          <w:rFonts w:ascii="Consolas" w:hAnsi="Consolas"/>
+          <w:color w:val="5B2C83"/>
+          <w:sz w:val="18"/>
+        </w:rPr>
+        <w:t>/api/products/demo/sql-injection</w:t>
+      </w:r>
+      <w:r>
+        <w:t xml:space="preserve">) que encaminha o parâmetro </w:t>
+      </w:r>
+      <w:r>
+        <w:rPr>
+          <w:rFonts w:ascii="Consolas" w:hAnsi="Consolas"/>
+          <w:color w:val="5B2C83"/>
+          <w:sz w:val="18"/>
+        </w:rPr>
+        <w:t>name</w:t>
+      </w:r>
+      <w:r>
+        <w:t xml:space="preserve"> ao método de laboratório em </w:t>
+      </w:r>
+      <w:r>
+        <w:rPr>
+          <w:rFonts w:ascii="Consolas" w:hAnsi="Consolas"/>
+          <w:color w:val="5B2C83"/>
+          <w:sz w:val="18"/>
+        </w:rPr>
+        <w:t>ProductRepository.java</w:t>
+      </w:r>
+      <w:r>
+        <w:t xml:space="preserve">. Esse método monta a instrução SQL concatenando a entrada recebida e a envia a </w:t>
+      </w:r>
+      <w:r>
+        <w:rPr>
+          <w:rFonts w:ascii="Consolas" w:hAnsi="Consolas"/>
+          <w:color w:val="5B2C83"/>
+          <w:sz w:val="18"/>
+        </w:rPr>
+        <w:t>jdbcTemplate.query</w:t>
+      </w:r>
+      <w:r>
+        <w:t>. A rota e a concatenação são as partes deliberadamente inseguras.</w:t>
+      </w:r>
+    </w:p>
+    <w:p>
+      <w:pPr>
+        <w:jc w:val="center"/>
+      </w:pPr>
+      <w:r>
+        <w:drawing>
+          <wp:inline xmlns:a="http://schemas.openxmlformats.org/drawingml/2006/main" xmlns:pic="http://schemas.openxmlformats.org/drawingml/2006/picture">
+            <wp:extent cx="5806440" cy="3268131"/>
+            <wp:docPr id="6" name="Picture 6"/>
+            <wp:cNvGraphicFramePr>
+              <a:graphicFrameLocks noChangeAspect="1"/>
+            </wp:cNvGraphicFramePr>
+            <a:graphic>
+              <a:graphicData uri="http://schemas.openxmlformats.org/drawingml/2006/picture">
+                <pic:pic>
+                  <pic:nvPicPr>
+                    <pic:cNvPr id="0" name="pr9-controller.jpg"/>
+                    <pic:cNvPicPr/>
+                  </pic:nvPicPr>
+                  <pic:blipFill>
+                    <a:blip r:embed="rId16"/>
+                    <a:stretch>
+                      <a:fillRect/>
+                    </a:stretch>
+                  </pic:blipFill>
+                  <pic:spPr>
+                    <a:xfrm>
+                      <a:off x="0" y="0"/>
+                      <a:ext cx="5806440" cy="3268131"/>
+                    </a:xfrm>
+                    <a:prstGeom prst="rect"/>
+                  </pic:spPr>
+                </pic:pic>
+              </a:graphicData>
+            </a:graphic>
+          </wp:inline>
+        </w:drawing>
+      </w:r>
+    </w:p>
+    <w:p>
+      <w:pPr>
+        <w:pStyle w:val="Caption"/>
+        <w:jc w:val="center"/>
+      </w:pPr>
+      <w:r>
+        <w:t>Diff do controller: rota de demonstração direciona a chamada ao método vulnerável</w:t>
+      </w:r>
+    </w:p>
+    <w:p>
+      <w:pPr>
+        <w:jc w:val="center"/>
+      </w:pPr>
+      <w:r>
+        <w:drawing>
+          <wp:inline xmlns:a="http://schemas.openxmlformats.org/drawingml/2006/main" xmlns:pic="http://schemas.openxmlformats.org/drawingml/2006/picture">
+            <wp:extent cx="5806440" cy="3268131"/>
+            <wp:docPr id="7" name="Picture 7"/>
+            <wp:cNvGraphicFramePr>
+              <a:graphicFrameLocks noChangeAspect="1"/>
+            </wp:cNvGraphicFramePr>
+            <a:graphic>
+              <a:graphicData uri="http://schemas.openxmlformats.org/drawingml/2006/picture">
+                <pic:pic>
+                  <pic:nvPicPr>
+                    <pic:cNvPr id="0" name="pr9-files.jpg"/>
+                    <pic:cNvPicPr/>
+                  </pic:nvPicPr>
+                  <pic:blipFill>
+                    <a:blip r:embed="rId17"/>
+                    <a:stretch>
+                      <a:fillRect/>
+                    </a:stretch>
+                  </pic:blipFill>
+                  <pic:spPr>
+                    <a:xfrm>
+                      <a:off x="0" y="0"/>
+                      <a:ext cx="5806440" cy="3268131"/>
+                    </a:xfrm>
+                    <a:prstGeom prst="rect"/>
+                  </pic:spPr>
+                </pic:pic>
+              </a:graphicData>
+            </a:graphic>
+          </wp:inline>
+        </w:drawing>
+      </w:r>
+    </w:p>
+    <w:p>
+      <w:pPr>
+        <w:pStyle w:val="Caption"/>
+        <w:jc w:val="center"/>
+      </w:pPr>
+      <w:r>
+        <w:t>Diff do repositório: a consulta SQL concatena diretamente o parâmetro recebido</w:t>
+      </w:r>
+    </w:p>
+    <w:p>
+      <w:r>
+        <w:rPr>
+          <w:b/>
+        </w:rPr>
+        <w:t>O que funciona e o que não foi verificado neste PR:</w:t>
+      </w:r>
+      <w:r>
+        <w:t xml:space="preserve"> o build Maven pode compilar a aplicação e os testes existentes podem passar mesmo com esse caminho inseguro, pois sucesso de build não é análise estática de segurança. Na execução atual do PR #9, o GitHub Actions passou; como o Code Scanning está desligado, nenhum alerta do CodeQL era esperado. O cartão “Ready to merge” também não certifica segurança: indica apenas o estado das regras e checks configurados no repositório naquele momento.</w:t>
+      </w:r>
+    </w:p>
+    <w:p>
+      <w:pPr>
+        <w:pStyle w:val="Heading2"/>
+      </w:pPr>
+      <w:r>
+        <w:t>Evidência anterior com Code Scanning ativo</w:t>
+      </w:r>
+    </w:p>
+    <w:p>
+      <w:r>
+        <w:t xml:space="preserve">Para comparar com o caso atual, o PR histórico </w:t>
+      </w:r>
+      <w:r>
+        <w:t>#7 — https://github.com/aeroschmidt/scanner-loja-instrumentos/pull/7</w:t>
+      </w:r>
+      <w:r>
+        <w:t xml:space="preserve"> contém a captura de uma análise do CodeQL que apontou um alerta </w:t>
+      </w:r>
+      <w:r>
+        <w:rPr>
+          <w:b/>
+        </w:rPr>
+        <w:t>High</w:t>
+      </w:r>
+      <w:r>
+        <w:t xml:space="preserve"> na chamada de </w:t>
+      </w:r>
+      <w:r>
+        <w:rPr>
+          <w:rFonts w:ascii="Consolas" w:hAnsi="Consolas"/>
+          <w:color w:val="5B2C83"/>
+          <w:sz w:val="18"/>
+        </w:rPr>
+        <w:t>jdbcTemplate.query</w:t>
+      </w:r>
+      <w:r>
+        <w:t>, na linha que envia a consulta concatenada. A origem do dado não confiável aparece na montagem da SQL logo acima. A alteração foi posteriormente corrigida antes de o PR #7 ser integrado; a captura documenta a revisão histórica, não o estado atual da branch principal.</w:t>
+      </w:r>
+    </w:p>
+    <w:p>
+      <w:pPr>
+        <w:jc w:val="center"/>
+      </w:pPr>
+      <w:r>
+        <w:drawing>
+          <wp:inline xmlns:a="http://schemas.openxmlformats.org/drawingml/2006/main" xmlns:pic="http://schemas.openxmlformats.org/drawingml/2006/picture">
+            <wp:extent cx="5806440" cy="3268131"/>
+            <wp:docPr id="8" name="Picture 8"/>
+            <wp:cNvGraphicFramePr>
+              <a:graphicFrameLocks noChangeAspect="1"/>
+            </wp:cNvGraphicFramePr>
+            <a:graphic>
+              <a:graphicData uri="http://schemas.openxmlformats.org/drawingml/2006/picture">
+                <pic:pic>
+                  <pic:nvPicPr>
+                    <pic:cNvPr id="0" name="pr7-code-scanning.jpg"/>
+                    <pic:cNvPicPr/>
+                  </pic:nvPicPr>
+                  <pic:blipFill>
+                    <a:blip r:embed="rId18"/>
+                    <a:stretch>
+                      <a:fillRect/>
+                    </a:stretch>
+                  </pic:blipFill>
+                  <pic:spPr>
+                    <a:xfrm>
+                      <a:off x="0" y="0"/>
+                      <a:ext cx="5806440" cy="3268131"/>
+                    </a:xfrm>
+                    <a:prstGeom prst="rect"/>
+                  </pic:spPr>
+                </pic:pic>
+              </a:graphicData>
+            </a:graphic>
+          </wp:inline>
+        </w:drawing>
+      </w:r>
+    </w:p>
+    <w:p>
+      <w:pPr>
+        <w:pStyle w:val="Caption"/>
+        <w:jc w:val="center"/>
+      </w:pPr>
+      <w:r>
+        <w:t>PR histórico: alerta High do CodeQL anotado na chamada jdbcTemplate.query</w:t>
+      </w:r>
+    </w:p>
+    <w:p>
+      <w:r>
+        <w:t xml:space="preserve">Na execução associada à versão vulnerável, o job Maven também falhou na etapa de testes. O log mostra </w:t>
+      </w:r>
+      <w:r>
+        <w:rPr>
+          <w:rFonts w:ascii="Consolas" w:hAnsi="Consolas"/>
+          <w:color w:val="5B2C83"/>
+          <w:sz w:val="18"/>
+        </w:rPr>
+        <w:t>BUILD FAILURE</w:t>
+      </w:r>
+      <w:r>
+        <w:t xml:space="preserve"> e falha do objetivo </w:t>
+      </w:r>
+      <w:r>
+        <w:rPr>
+          <w:rFonts w:ascii="Consolas" w:hAnsi="Consolas"/>
+          <w:color w:val="5B2C83"/>
+          <w:sz w:val="18"/>
+        </w:rPr>
+        <w:t>maven-surefire-plugin:test</w:t>
+      </w:r>
+      <w:r>
+        <w:t>. Esse resultado veio dos testes da aplicação; é diferente do alerta estático do CodeQL. Uma vulnerabilidade não precisa fazer o build falhar: neste exercício, a falha Maven e o alerta CodeQL foram sinais independentes.</w:t>
+      </w:r>
+    </w:p>
+    <w:p>
+      <w:pPr>
+        <w:jc w:val="center"/>
+      </w:pPr>
+      <w:r>
+        <w:drawing>
+          <wp:inline xmlns:a="http://schemas.openxmlformats.org/drawingml/2006/main" xmlns:pic="http://schemas.openxmlformats.org/drawingml/2006/picture">
+            <wp:extent cx="5806440" cy="3268131"/>
+            <wp:docPr id="9" name="Picture 9"/>
+            <wp:cNvGraphicFramePr>
+              <a:graphicFrameLocks noChangeAspect="1"/>
+            </wp:cNvGraphicFramePr>
+            <a:graphic>
+              <a:graphicData uri="http://schemas.openxmlformats.org/drawingml/2006/picture">
+                <pic:pic>
+                  <pic:nvPicPr>
+                    <pic:cNvPr id="0" name="pr7-checks.jpg"/>
+                    <pic:cNvPicPr/>
+                  </pic:nvPicPr>
+                  <pic:blipFill>
+                    <a:blip r:embed="rId19"/>
+                    <a:stretch>
+                      <a:fillRect/>
+                    </a:stretch>
+                  </pic:blipFill>
+                  <pic:spPr>
+                    <a:xfrm>
+                      <a:off x="0" y="0"/>
+                      <a:ext cx="5806440" cy="3268131"/>
+                    </a:xfrm>
+                    <a:prstGeom prst="rect"/>
+                  </pic:spPr>
+                </pic:pic>
+              </a:graphicData>
+            </a:graphic>
+          </wp:inline>
+        </w:drawing>
+      </w:r>
+    </w:p>
+    <w:p>
+      <w:pPr>
+        <w:pStyle w:val="Caption"/>
+        <w:jc w:val="center"/>
+      </w:pPr>
+      <w:r>
+        <w:t>Execução histórica: o job Maven falhou na etapa de testes</w:t>
+      </w:r>
+    </w:p>
+    <w:p>
+      <w:r>
+        <w:t>O CodeQL pode apontar arquivo, localização e regra quando a análise executada reconhece o fluxo vulnerável. Isso, por si só, não torna o alerta um bloqueio de merge. Para impedir integração, a equipe precisa configurar uma regra que exija o check apropriado; além disso, alertas e checks são estados distintos. A decisão final deve seguir a revisão e aprovação humana exigidas pelo repositório.</w:t>
+      </w:r>
+    </w:p>
+    <w:p>
+      <w:pPr>
+        <w:pStyle w:val="Heading2"/>
+      </w:pPr>
+      <w:r>
+        <w:t>Como interpretar a comparação</w:t>
+      </w:r>
+    </w:p>
+    <w:p>
+      <w:pPr>
+        <w:pStyle w:val="ListBullet"/>
+      </w:pPr>
+      <w:r>
+        <w:rPr>
+          <w:b/>
+        </w:rPr>
+        <w:t>PR #8, documentação sem Code Scanning:</w:t>
+      </w:r>
+      <w:r>
+        <w:t xml:space="preserve"> o workflow de build/teste ficou verde e o diff foi pequeno. Isso não mostra uma análise de segurança do código.</w:t>
+      </w:r>
+    </w:p>
+    <w:p>
+      <w:pPr>
+        <w:pStyle w:val="ListBullet"/>
+      </w:pPr>
+      <w:r>
+        <w:rPr>
+          <w:b/>
+        </w:rPr>
+        <w:t>PR #9, SQL Injection com Code Scanning desligado:</w:t>
+      </w:r>
+      <w:r>
+        <w:t xml:space="preserve"> o workflow ficou verde e o diff mostra o caminho inseguro; não há check do CodeQL. Isso não significa que o código está seguro nem que passou por análise estática.</w:t>
+      </w:r>
+    </w:p>
+    <w:p>
+      <w:pPr>
+        <w:pStyle w:val="ListBullet"/>
+      </w:pPr>
+      <w:r>
+        <w:rPr>
+          <w:b/>
+        </w:rPr>
+        <w:t>PR #7 histórico, CodeQL ativo:</w:t>
+      </w:r>
+      <w:r>
+        <w:t xml:space="preserve"> há um alerta High localizado na chamada SQL e um job Maven que falhou nos testes. Isso não significa que todo alerta falha o build ou bloqueia o merge.</w:t>
+      </w:r>
+    </w:p>
+    <w:p>
+      <w:r>
+        <w:t>Os screenshots preservam o contexto de cada tela. Ao registrar uma nova ferramenta ou alteração de configuração, capture também o estado anterior, o diff, os checks e a localização do alerta ou falha; identifique se a imagem é atual ou histórica e não exponha credenciais ou dados reais.</w:t>
+      </w:r>
+    </w:p>
     <w:sectPr>
       <w:headerReference w:type="default" r:id="rId9"/>
       <w:footerReference w:type="default" r:id="rId10"/>

</xml_diff>